<commit_message>
Convert report evidence screenshots to grayscale
</commit_message>
<xml_diff>
--- a/docs/Informe_Ticket_Resilience_Lab_logo_color.docx
+++ b/docs/Informe_Ticket_Resilience_Lab_logo_color.docx
@@ -1077,7 +1077,7 @@
               <a:graphicData uri="http://schemas.openxmlformats.org/drawingml/2006/picture">
                 <pic:pic>
                   <pic:nvPicPr>
-                    <pic:cNvPr id="0" name="architecture-distribution.png"/>
+                    <pic:cNvPr id="0" name="architecture-distribution-bw.png"/>
                     <pic:cNvPicPr/>
                   </pic:nvPicPr>
                   <pic:blipFill>
@@ -1736,7 +1736,7 @@
               <a:graphicData uri="http://schemas.openxmlformats.org/drawingml/2006/picture">
                 <pic:pic>
                   <pic:nvPicPr>
-                    <pic:cNvPr id="0" name="09-chaos-inventory-down-http-503.png"/>
+                    <pic:cNvPr id="0" name="09-chaos-inventory-down-http-503-bw.png"/>
                     <pic:cNvPicPr/>
                   </pic:nvPicPr>
                   <pic:blipFill>
@@ -1850,7 +1850,7 @@
               <a:graphicData uri="http://schemas.openxmlformats.org/drawingml/2006/picture">
                 <pic:pic>
                   <pic:nvPicPr>
-                    <pic:cNvPr id="0" name="12-chaos-payments-slow-circuit-breaker-open-2.png"/>
+                    <pic:cNvPr id="0" name="12-chaos-payments-slow-circuit-breaker-open-2-bw.png"/>
                     <pic:cNvPicPr/>
                   </pic:nvPicPr>
                   <pic:blipFill>
@@ -1964,7 +1964,7 @@
               <a:graphicData uri="http://schemas.openxmlformats.org/drawingml/2006/picture">
                 <pic:pic>
                   <pic:nvPicPr>
-                    <pic:cNvPr id="0" name="15-chaos-notifications-down-fallback-pending.png"/>
+                    <pic:cNvPr id="0" name="15-chaos-notifications-down-fallback-pending-bw.png"/>
                     <pic:cNvPicPr/>
                   </pic:nvPicPr>
                   <pic:blipFill>
@@ -2078,7 +2078,7 @@
               <a:graphicData uri="http://schemas.openxmlformats.org/drawingml/2006/picture">
                 <pic:pic>
                   <pic:nvPicPr>
-                    <pic:cNvPr id="0" name="17-chaos-traffic-spike-rate-limit-429.png"/>
+                    <pic:cNvPr id="0" name="17-chaos-traffic-spike-rate-limit-429-bw.png"/>
                     <pic:cNvPicPr/>
                   </pic:nvPicPr>
                   <pic:blipFill>
@@ -3012,7 +3012,7 @@
               <a:graphicData uri="http://schemas.openxmlformats.org/drawingml/2006/picture">
                 <pic:pic>
                   <pic:nvPicPr>
-                    <pic:cNvPr id="0" name="01-k8s-dos-nodos-ready.png"/>
+                    <pic:cNvPr id="0" name="01-k8s-dos-nodos-ready-bw.png"/>
                     <pic:cNvPicPr/>
                   </pic:nvPicPr>
                   <pic:blipFill>
@@ -3063,7 +3063,7 @@
               <a:graphicData uri="http://schemas.openxmlformats.org/drawingml/2006/picture">
                 <pic:pic>
                   <pic:nvPicPr>
-                    <pic:cNvPr id="0" name="02-k8s-pods-inventory-replicado-dos-nodos.png"/>
+                    <pic:cNvPr id="0" name="02-k8s-pods-inventory-replicado-dos-nodos-bw.png"/>
                     <pic:cNvPicPr/>
                   </pic:nvPicPr>
                   <pic:blipFill>
@@ -3114,7 +3114,7 @@
               <a:graphicData uri="http://schemas.openxmlformats.org/drawingml/2006/picture">
                 <pic:pic>
                   <pic:nvPicPr>
-                    <pic:cNvPr id="0" name="03-port-forward-servicios-locales.png"/>
+                    <pic:cNvPr id="0" name="03-port-forward-servicios-locales-bw.png"/>
                     <pic:cNvPicPr/>
                   </pic:nvPicPr>
                   <pic:blipFill>
@@ -3165,7 +3165,7 @@
               <a:graphicData uri="http://schemas.openxmlformats.org/drawingml/2006/picture">
                 <pic:pic>
                   <pic:nvPicPr>
-                    <pic:cNvPr id="0" name="04-baseline-health-inventario-inicial-1.png"/>
+                    <pic:cNvPr id="0" name="04-baseline-health-inventario-inicial-1-bw.png"/>
                     <pic:cNvPicPr/>
                   </pic:nvPicPr>
                   <pic:blipFill>
@@ -3216,7 +3216,7 @@
               <a:graphicData uri="http://schemas.openxmlformats.org/drawingml/2006/picture">
                 <pic:pic>
                   <pic:nvPicPr>
-                    <pic:cNvPr id="0" name="06-baseline-reserva-exitosa.png"/>
+                    <pic:cNvPr id="0" name="06-baseline-reserva-exitosa-bw.png"/>
                     <pic:cNvPicPr/>
                   </pic:nvPicPr>
                   <pic:blipFill>
@@ -3267,7 +3267,7 @@
               <a:graphicData uri="http://schemas.openxmlformats.org/drawingml/2006/picture">
                 <pic:pic>
                   <pic:nvPicPr>
-                    <pic:cNvPr id="0" name="07-baseline-inventario-despues-1.png"/>
+                    <pic:cNvPr id="0" name="07-baseline-inventario-despues-1-bw.png"/>
                     <pic:cNvPicPr/>
                   </pic:nvPicPr>
                   <pic:blipFill>
@@ -3318,7 +3318,7 @@
               <a:graphicData uri="http://schemas.openxmlformats.org/drawingml/2006/picture">
                 <pic:pic>
                   <pic:nvPicPr>
-                    <pic:cNvPr id="0" name="09-chaos-inventory-down-http-503.png"/>
+                    <pic:cNvPr id="0" name="09-chaos-inventory-down-http-503-bw.png"/>
                     <pic:cNvPicPr/>
                   </pic:nvPicPr>
                   <pic:blipFill>
@@ -3369,7 +3369,7 @@
               <a:graphicData uri="http://schemas.openxmlformats.org/drawingml/2006/picture">
                 <pic:pic>
                   <pic:nvPicPr>
-                    <pic:cNvPr id="0" name="12-chaos-payments-slow-circuit-breaker-open-2.png"/>
+                    <pic:cNvPr id="0" name="12-chaos-payments-slow-circuit-breaker-open-2-bw.png"/>
                     <pic:cNvPicPr/>
                   </pic:nvPicPr>
                   <pic:blipFill>
@@ -3420,7 +3420,7 @@
               <a:graphicData uri="http://schemas.openxmlformats.org/drawingml/2006/picture">
                 <pic:pic>
                   <pic:nvPicPr>
-                    <pic:cNvPr id="0" name="15-chaos-notifications-down-fallback-pending.png"/>
+                    <pic:cNvPr id="0" name="15-chaos-notifications-down-fallback-pending-bw.png"/>
                     <pic:cNvPicPr/>
                   </pic:nvPicPr>
                   <pic:blipFill>
@@ -3471,7 +3471,7 @@
               <a:graphicData uri="http://schemas.openxmlformats.org/drawingml/2006/picture">
                 <pic:pic>
                   <pic:nvPicPr>
-                    <pic:cNvPr id="0" name="17-chaos-traffic-spike-rate-limit-429.png"/>
+                    <pic:cNvPr id="0" name="17-chaos-traffic-spike-rate-limit-429-bw.png"/>
                     <pic:cNvPicPr/>
                   </pic:nvPicPr>
                   <pic:blipFill>

</xml_diff>